<commit_message>
Athlete Poster: real quote + chosen font, recrop-before-Select-Subject fix
Requires a real quote the athlete actually said, set in a font (typeface) the
student picks to fit the poster's aesthetic: stated on the overview and in the
"Add Your Words" build steps (Step 01 and Step 02). Adds a reflection question
on which font they chose and why (now 4 questions; Step 03 copy updated to match).

Adds the important pre-step before Select Subject: recrop the image first with the
Rectangular Marquee (M), Command + A, then Image > Crop, or the Select Subject mask
comes out off. Applied to both Step 01 and Step 02, EN + ES.

Co-Authored-By: Claude Opus 4.8 <noreply@anthropic.com>
</commit_message>
<xml_diff>
--- a/assets/course-documents/Athlete-Poster-Reflection-EN.docx
+++ b/assets/course-documents/Athlete-Poster-Reflection-EN.docx
@@ -326,7 +326,7 @@
                 <w:sz w:val="23"/>
                 <w:szCs w:val="23"/>
               </w:rPr>
-              <w:t xml:space="preserve">What was the hardest part of the design?</w:t>
+              <w:t xml:space="preserve">What font (typeface) did you choose for your quote, and why does it fit your poster?</w:t>
             </w:r>
           </w:p>
         </w:tc>
@@ -446,7 +446,7 @@
                 <w:sz w:val="23"/>
                 <w:szCs w:val="23"/>
               </w:rPr>
-              <w:t xml:space="preserve">What did you enjoy about this project?</w:t>
+              <w:t xml:space="preserve">What was the hardest part of the design?</w:t>
             </w:r>
           </w:p>
         </w:tc>
@@ -518,6 +518,126 @@
         <w:t xml:space="preserve"/>
       </w:r>
     </w:p>
+    <w:tbl>
+      <w:tblPr>
+        <w:tblW w:type="dxa" w:w="10800"/>
+        <w:tblBorders>
+          <w:top w:val="none"/>
+          <w:left w:val="none"/>
+          <w:bottom w:val="none"/>
+          <w:right w:val="none"/>
+          <w:insideH w:val="single" w:color="auto" w:sz="4"/>
+          <w:insideV w:val="single" w:color="auto" w:sz="4"/>
+        </w:tblBorders>
+      </w:tblPr>
+      <w:tblGrid>
+        <w:gridCol w:w="10800"/>
+      </w:tblGrid>
+      <w:tr>
+        <w:tc>
+          <w:tcPr>
+            <w:tcW w:type="dxa" w:w="10800"/>
+            <w:shd w:fill="007474" w:val="clear"/>
+            <w:tcMar>
+              <w:top w:type="dxa" w:w="70"/>
+              <w:left w:type="dxa" w:w="160"/>
+              <w:bottom w:type="dxa" w:w="70"/>
+              <w:right w:type="dxa" w:w="160"/>
+            </w:tcMar>
+          </w:tcPr>
+          <w:p>
+            <w:r>
+              <w:rPr>
+                <w:rFonts w:ascii="Arial" w:cs="Arial" w:eastAsia="Arial" w:hAnsi="Arial"/>
+                <w:b/>
+                <w:bCs/>
+                <w:color w:val="FFFFFF"/>
+                <w:sz w:val="23"/>
+                <w:szCs w:val="23"/>
+              </w:rPr>
+              <w:t xml:space="preserve">4.  </w:t>
+            </w:r>
+            <w:r>
+              <w:rPr>
+                <w:rFonts w:ascii="Arial" w:cs="Arial" w:eastAsia="Arial" w:hAnsi="Arial"/>
+                <w:b/>
+                <w:bCs/>
+                <w:color w:val="FFFFFF"/>
+                <w:sz w:val="23"/>
+                <w:szCs w:val="23"/>
+              </w:rPr>
+              <w:t xml:space="preserve">What did you enjoy about this project?</w:t>
+            </w:r>
+          </w:p>
+        </w:tc>
+      </w:tr>
+    </w:tbl>
+    <w:p>
+      <w:pPr>
+        <w:spacing w:after="60"/>
+      </w:pPr>
+      <w:r>
+        <w:t xml:space="preserve"/>
+      </w:r>
+    </w:p>
+    <w:tbl>
+      <w:tblPr>
+        <w:tblW w:type="dxa" w:w="10800"/>
+        <w:tblBorders>
+          <w:top w:val="single" w:color="auto" w:sz="4"/>
+          <w:left w:val="single" w:color="auto" w:sz="4"/>
+          <w:bottom w:val="single" w:color="auto" w:sz="4"/>
+          <w:right w:val="single" w:color="auto" w:sz="4"/>
+          <w:insideH w:val="single" w:color="auto" w:sz="4"/>
+          <w:insideV w:val="single" w:color="auto" w:sz="4"/>
+        </w:tblBorders>
+      </w:tblPr>
+      <w:tblGrid>
+        <w:gridCol w:w="10800"/>
+      </w:tblGrid>
+      <w:tr>
+        <w:trPr>
+          <w:trHeight w:val="1500" w:hRule="atLeast"/>
+        </w:trPr>
+        <w:tc>
+          <w:tcPr>
+            <w:tcW w:type="dxa" w:w="10800"/>
+            <w:tcBorders>
+              <w:top w:val="single" w:color="C4C4C4" w:sz="8"/>
+              <w:left w:val="single" w:color="C4C4C4" w:sz="8"/>
+              <w:bottom w:val="single" w:color="C4C4C4" w:sz="8"/>
+              <w:right w:val="single" w:color="C4C4C4" w:sz="8"/>
+            </w:tcBorders>
+            <w:tcMar>
+              <w:top w:type="dxa" w:w="100"/>
+              <w:left w:type="dxa" w:w="160"/>
+              <w:bottom w:type="dxa" w:w="100"/>
+              <w:right w:type="dxa" w:w="160"/>
+            </w:tcMar>
+          </w:tcPr>
+          <w:p>
+            <w:r>
+              <w:rPr>
+                <w:i/>
+                <w:iCs/>
+                <w:color w:val="8A8A8A"/>
+                <w:sz w:val="22"/>
+                <w:szCs w:val="22"/>
+              </w:rPr>
+              <w:t xml:space="preserve">Type your answer here.</w:t>
+            </w:r>
+          </w:p>
+        </w:tc>
+      </w:tr>
+    </w:tbl>
+    <w:p>
+      <w:pPr>
+        <w:spacing w:after="160"/>
+      </w:pPr>
+      <w:r>
+        <w:t xml:space="preserve"/>
+      </w:r>
+    </w:p>
     <w:sectPr>
       <w:pgSz w:w="12240" w:h="15840" w:orient="portrait"/>
       <w:pgMar w:top="900" w:right="720" w:bottom="900" w:left="720" w:header="708" w:footer="708" w:gutter="0"/>

</xml_diff>